<commit_message>
ADDING TODAY'S WORK - 27.07.2026
</commit_message>
<xml_diff>
--- a/viva/viva_notes.docx
+++ b/viva/viva_notes.docx
@@ -69,15 +69,7 @@
         </w:numPr>
       </w:pPr>
       <w:r>
-        <w:t xml:space="preserve">Why did you only perform ORA during target-gene </w:t>
-      </w:r>
-      <w:proofErr w:type="gramStart"/>
-      <w:r>
-        <w:t>enrichment</w:t>
-      </w:r>
-      <w:proofErr w:type="gramEnd"/>
-      <w:r>
-        <w:t xml:space="preserve"> but you performed ORA and miRNA-SEA at miRNA-level? </w:t>
+        <w:t xml:space="preserve">Why did you only perform ORA during target-gene enrichment but you performed ORA and miRNA-SEA at miRNA-level? </w:t>
       </w:r>
     </w:p>
     <w:p>
@@ -93,108 +85,35 @@
           <w:b/>
           <w:bCs/>
         </w:rPr>
-        <w:t xml:space="preserve">Could have used </w:t>
+        <w:t>Could have used gsePathway()…</w:t>
       </w:r>
-      <w:proofErr w:type="spellStart"/>
-      <w:proofErr w:type="gramStart"/>
+    </w:p>
+    <w:p>
+      <w:pPr>
+        <w:pStyle w:val="ListParagraph"/>
+        <w:numPr>
+          <w:ilvl w:val="0"/>
+          <w:numId w:val="5"/>
+        </w:numPr>
+      </w:pPr>
+      <w:r>
+        <w:t>What would you do in the future, given more time and/or money?</w:t>
+      </w:r>
+    </w:p>
+    <w:p>
+      <w:pPr>
+        <w:pStyle w:val="ListParagraph"/>
+        <w:numPr>
+          <w:ilvl w:val="1"/>
+          <w:numId w:val="5"/>
+        </w:numPr>
+      </w:pPr>
       <w:r>
         <w:rPr>
           <w:b/>
           <w:bCs/>
         </w:rPr>
-        <w:t>gsePathway</w:t>
-      </w:r>
-      <w:proofErr w:type="spellEnd"/>
-      <w:r>
-        <w:rPr>
-          <w:b/>
-          <w:bCs/>
-        </w:rPr>
-        <w:t>(</w:t>
-      </w:r>
-      <w:proofErr w:type="gramEnd"/>
-      <w:r>
-        <w:rPr>
-          <w:b/>
-          <w:bCs/>
-        </w:rPr>
-        <w:t>)…</w:t>
-      </w:r>
-    </w:p>
-    <w:p>
-      <w:pPr>
-        <w:pStyle w:val="ListParagraph"/>
-        <w:numPr>
-          <w:ilvl w:val="0"/>
-          <w:numId w:val="5"/>
-        </w:numPr>
-      </w:pPr>
-      <w:r>
-        <w:t>What would you do in the future, given more time and/or money?</w:t>
-      </w:r>
-    </w:p>
-    <w:p>
-      <w:pPr>
-        <w:pStyle w:val="ListParagraph"/>
-        <w:numPr>
-          <w:ilvl w:val="1"/>
-          <w:numId w:val="5"/>
-        </w:numPr>
-      </w:pPr>
-      <w:r>
-        <w:rPr>
-          <w:b/>
-          <w:bCs/>
-        </w:rPr>
-        <w:t xml:space="preserve">Could look at detecting different types of small </w:t>
-      </w:r>
-      <w:proofErr w:type="spellStart"/>
-      <w:r>
-        <w:rPr>
-          <w:b/>
-          <w:bCs/>
-        </w:rPr>
-        <w:t>rna</w:t>
-      </w:r>
-      <w:proofErr w:type="spellEnd"/>
-      <w:r>
-        <w:rPr>
-          <w:b/>
-          <w:bCs/>
-        </w:rPr>
-        <w:t xml:space="preserve"> species e.g., what </w:t>
-      </w:r>
-      <w:proofErr w:type="spellStart"/>
-      <w:r>
-        <w:rPr>
-          <w:b/>
-          <w:bCs/>
-        </w:rPr>
-        <w:t>tamirna</w:t>
-      </w:r>
-      <w:proofErr w:type="spellEnd"/>
-      <w:r>
-        <w:rPr>
-          <w:b/>
-          <w:bCs/>
-        </w:rPr>
-        <w:t xml:space="preserve"> does in their </w:t>
-      </w:r>
-      <w:proofErr w:type="gramStart"/>
-      <w:r>
-        <w:rPr>
-          <w:b/>
-          <w:bCs/>
-        </w:rPr>
-        <w:t>reads</w:t>
-      </w:r>
-      <w:proofErr w:type="gramEnd"/>
-      <w:r>
-        <w:rPr>
-          <w:b/>
-          <w:bCs/>
-        </w:rPr>
-        <w:t xml:space="preserve"> classification table</w:t>
+        <w:t>Could look at detecting different types of small rna species e.g., what tamirna does in their reads classification table</w:t>
       </w:r>
     </w:p>
     <w:sectPr>

</xml_diff>

<commit_message>
ADDING TODAY'S WORK - 03.08.2026
</commit_message>
<xml_diff>
--- a/viva/viva_notes.docx
+++ b/viva/viva_notes.docx
@@ -5,6 +5,176 @@
     <w:p>
       <w:pPr>
         <w:ind w:left="720" w:hanging="360"/>
+        <w:rPr>
+          <w:b/>
+          <w:bCs/>
+        </w:rPr>
+      </w:pPr>
+      <w:r>
+        <w:rPr>
+          <w:b/>
+          <w:bCs/>
+        </w:rPr>
+        <w:t>Notes from lecture 3</w:t>
+      </w:r>
+    </w:p>
+    <w:p>
+      <w:pPr>
+        <w:pStyle w:val="ListParagraph"/>
+        <w:numPr>
+          <w:ilvl w:val="0"/>
+          <w:numId w:val="6"/>
+        </w:numPr>
+      </w:pPr>
+      <w:r>
+        <w:t>Re-read the thesis a few times (e.g., a few weeks after submission) and make notes of things that you could be asked questions on</w:t>
+      </w:r>
+    </w:p>
+    <w:p>
+      <w:pPr>
+        <w:pStyle w:val="ListParagraph"/>
+        <w:numPr>
+          <w:ilvl w:val="0"/>
+          <w:numId w:val="6"/>
+        </w:numPr>
+      </w:pPr>
+      <w:r>
+        <w:t>Bring copy of thesis with me. It can be electronic. They will make references to things based on page number</w:t>
+      </w:r>
+    </w:p>
+    <w:p>
+      <w:pPr>
+        <w:pStyle w:val="ListParagraph"/>
+        <w:numPr>
+          <w:ilvl w:val="0"/>
+          <w:numId w:val="6"/>
+        </w:numPr>
+      </w:pPr>
+      <w:r>
+        <w:t>Example questions on lecture slides</w:t>
+      </w:r>
+    </w:p>
+    <w:p>
+      <w:pPr>
+        <w:pStyle w:val="ListParagraph"/>
+        <w:numPr>
+          <w:ilvl w:val="1"/>
+          <w:numId w:val="6"/>
+        </w:numPr>
+      </w:pPr>
+      <w:r>
+        <w:t>Limits to data collection can be high money cost</w:t>
+      </w:r>
+    </w:p>
+    <w:p>
+      <w:pPr>
+        <w:pStyle w:val="ListParagraph"/>
+        <w:numPr>
+          <w:ilvl w:val="1"/>
+          <w:numId w:val="6"/>
+        </w:numPr>
+      </w:pPr>
+      <w:r>
+        <w:t xml:space="preserve">One common last question is ‘if you have more money and time what </w:t>
+      </w:r>
+      <w:proofErr w:type="gramStart"/>
+      <w:r>
+        <w:t>would you</w:t>
+      </w:r>
+      <w:proofErr w:type="gramEnd"/>
+      <w:r>
+        <w:t xml:space="preserve"> do next?’ and ‘is your research useful to someone else?’</w:t>
+      </w:r>
+    </w:p>
+    <w:p>
+      <w:pPr>
+        <w:pStyle w:val="ListParagraph"/>
+        <w:numPr>
+          <w:ilvl w:val="0"/>
+          <w:numId w:val="6"/>
+        </w:numPr>
+      </w:pPr>
+      <w:r>
+        <w:t>Can ask them to repeat the question</w:t>
+      </w:r>
+    </w:p>
+    <w:p>
+      <w:pPr>
+        <w:pStyle w:val="ListParagraph"/>
+        <w:numPr>
+          <w:ilvl w:val="0"/>
+          <w:numId w:val="6"/>
+        </w:numPr>
+      </w:pPr>
+      <w:r>
+        <w:t>Tips for presentation in lecture slides</w:t>
+      </w:r>
+    </w:p>
+    <w:p>
+      <w:pPr>
+        <w:pStyle w:val="ListParagraph"/>
+        <w:numPr>
+          <w:ilvl w:val="0"/>
+          <w:numId w:val="6"/>
+        </w:numPr>
+      </w:pPr>
+      <w:r>
+        <w:t>Use a mouse or pointer to indicate important things about figures (could also just circle important bits)</w:t>
+      </w:r>
+    </w:p>
+    <w:p>
+      <w:pPr>
+        <w:pStyle w:val="ListParagraph"/>
+        <w:numPr>
+          <w:ilvl w:val="0"/>
+          <w:numId w:val="6"/>
+        </w:numPr>
+      </w:pPr>
+      <w:r>
+        <w:t>Bring backup pdf version</w:t>
+      </w:r>
+    </w:p>
+    <w:p>
+      <w:pPr>
+        <w:pStyle w:val="ListParagraph"/>
+        <w:numPr>
+          <w:ilvl w:val="0"/>
+          <w:numId w:val="6"/>
+        </w:numPr>
+      </w:pPr>
+      <w:r>
+        <w:t xml:space="preserve">Can test the </w:t>
+      </w:r>
+      <w:proofErr w:type="spellStart"/>
+      <w:r>
+        <w:t>powerpoint</w:t>
+      </w:r>
+      <w:proofErr w:type="spellEnd"/>
+      <w:r>
+        <w:t xml:space="preserve"> in the room before the presentation date</w:t>
+      </w:r>
+    </w:p>
+    <w:p>
+      <w:pPr>
+        <w:pStyle w:val="ListParagraph"/>
+        <w:numPr>
+          <w:ilvl w:val="0"/>
+          <w:numId w:val="6"/>
+        </w:numPr>
+      </w:pPr>
+      <w:r>
+        <w:t>Conclusion / key takeaways slide at end is very important</w:t>
+      </w:r>
+    </w:p>
+    <w:p>
+      <w:pPr>
+        <w:pStyle w:val="ListParagraph"/>
+        <w:ind w:left="1080"/>
+      </w:pPr>
+    </w:p>
+    <w:p>
+      <w:pPr>
+        <w:ind w:left="720" w:hanging="360"/>
       </w:pPr>
       <w:r>
         <w:rPr>
@@ -50,6 +220,15 @@
         <w:t>Furthermore, miRNAs can target huge numbers of genes, many of which may not be relevant within the biological context and act as noise for pathway enrichment analysis, reducing statistical power and increasing Type 1 errors [reference].</w:t>
       </w:r>
     </w:p>
+    <w:p>
+      <w:pPr>
+        <w:pStyle w:val="ListParagraph"/>
+        <w:numPr>
+          <w:ilvl w:val="0"/>
+          <w:numId w:val="3"/>
+        </w:numPr>
+      </w:pPr>
+    </w:p>
     <w:p/>
     <w:p>
       <w:r>
@@ -69,7 +248,15 @@
         </w:numPr>
       </w:pPr>
       <w:r>
-        <w:t xml:space="preserve">Why did you only perform ORA during target-gene enrichment but you performed ORA and miRNA-SEA at miRNA-level? </w:t>
+        <w:t xml:space="preserve">Why did you only perform ORA during target-gene </w:t>
+      </w:r>
+      <w:proofErr w:type="gramStart"/>
+      <w:r>
+        <w:t>enrichment</w:t>
+      </w:r>
+      <w:proofErr w:type="gramEnd"/>
+      <w:r>
+        <w:t xml:space="preserve"> but you performed ORA and miRNA-SEA at miRNA-level? </w:t>
       </w:r>
     </w:p>
     <w:p>
@@ -85,7 +272,32 @@
           <w:b/>
           <w:bCs/>
         </w:rPr>
-        <w:t>Could have used gsePathway()…</w:t>
+        <w:t xml:space="preserve">Could have used </w:t>
+      </w:r>
+      <w:proofErr w:type="spellStart"/>
+      <w:proofErr w:type="gramStart"/>
+      <w:r>
+        <w:rPr>
+          <w:b/>
+          <w:bCs/>
+        </w:rPr>
+        <w:t>gsePathway</w:t>
+      </w:r>
+      <w:proofErr w:type="spellEnd"/>
+      <w:r>
+        <w:rPr>
+          <w:b/>
+          <w:bCs/>
+        </w:rPr>
+        <w:t>(</w:t>
+      </w:r>
+      <w:proofErr w:type="gramEnd"/>
+      <w:r>
+        <w:rPr>
+          <w:b/>
+          <w:bCs/>
+        </w:rPr>
+        <w:t>)…</w:t>
       </w:r>
     </w:p>
     <w:p>
@@ -113,7 +325,55 @@
           <w:b/>
           <w:bCs/>
         </w:rPr>
-        <w:t>Could look at detecting different types of small rna species e.g., what tamirna does in their reads classification table</w:t>
+        <w:t xml:space="preserve">Could look at detecting different types of small </w:t>
+      </w:r>
+      <w:proofErr w:type="spellStart"/>
+      <w:r>
+        <w:rPr>
+          <w:b/>
+          <w:bCs/>
+        </w:rPr>
+        <w:t>rna</w:t>
+      </w:r>
+      <w:proofErr w:type="spellEnd"/>
+      <w:r>
+        <w:rPr>
+          <w:b/>
+          <w:bCs/>
+        </w:rPr>
+        <w:t xml:space="preserve"> species e.g., what </w:t>
+      </w:r>
+      <w:proofErr w:type="spellStart"/>
+      <w:r>
+        <w:rPr>
+          <w:b/>
+          <w:bCs/>
+        </w:rPr>
+        <w:t>tamirna</w:t>
+      </w:r>
+      <w:proofErr w:type="spellEnd"/>
+      <w:r>
+        <w:rPr>
+          <w:b/>
+          <w:bCs/>
+        </w:rPr>
+        <w:t xml:space="preserve"> does in their </w:t>
+      </w:r>
+      <w:proofErr w:type="gramStart"/>
+      <w:r>
+        <w:rPr>
+          <w:b/>
+          <w:bCs/>
+        </w:rPr>
+        <w:t>reads</w:t>
+      </w:r>
+      <w:proofErr w:type="gramEnd"/>
+      <w:r>
+        <w:rPr>
+          <w:b/>
+          <w:bCs/>
+        </w:rPr>
+        <w:t xml:space="preserve"> classification table</w:t>
       </w:r>
     </w:p>
     <w:sectPr>
@@ -242,6 +502,119 @@
     </w:lvl>
   </w:abstractNum>
   <w:abstractNum w:abstractNumId="1" w15:restartNumberingAfterBreak="0">
+    <w:nsid w:val="15701FE9"/>
+    <w:multiLevelType w:val="hybridMultilevel"/>
+    <w:tmpl w:val="B3A43F72"/>
+    <w:lvl w:ilvl="0" w:tplc="08090001">
+      <w:start w:val="1"/>
+      <w:numFmt w:val="bullet"/>
+      <w:lvlText w:val=""/>
+      <w:lvlJc w:val="left"/>
+      <w:pPr>
+        <w:ind w:left="1080" w:hanging="360"/>
+      </w:pPr>
+      <w:rPr>
+        <w:rFonts w:ascii="Symbol" w:hAnsi="Symbol" w:hint="default"/>
+      </w:rPr>
+    </w:lvl>
+    <w:lvl w:ilvl="1" w:tplc="08090003">
+      <w:start w:val="1"/>
+      <w:numFmt w:val="bullet"/>
+      <w:lvlText w:val="o"/>
+      <w:lvlJc w:val="left"/>
+      <w:pPr>
+        <w:ind w:left="1800" w:hanging="360"/>
+      </w:pPr>
+      <w:rPr>
+        <w:rFonts w:ascii="Courier New" w:hAnsi="Courier New" w:cs="Courier New" w:hint="default"/>
+      </w:rPr>
+    </w:lvl>
+    <w:lvl w:ilvl="2" w:tplc="08090005" w:tentative="1">
+      <w:start w:val="1"/>
+      <w:numFmt w:val="bullet"/>
+      <w:lvlText w:val=""/>
+      <w:lvlJc w:val="left"/>
+      <w:pPr>
+        <w:ind w:left="2520" w:hanging="360"/>
+      </w:pPr>
+      <w:rPr>
+        <w:rFonts w:ascii="Wingdings" w:hAnsi="Wingdings" w:hint="default"/>
+      </w:rPr>
+    </w:lvl>
+    <w:lvl w:ilvl="3" w:tplc="08090001" w:tentative="1">
+      <w:start w:val="1"/>
+      <w:numFmt w:val="bullet"/>
+      <w:lvlText w:val=""/>
+      <w:lvlJc w:val="left"/>
+      <w:pPr>
+        <w:ind w:left="3240" w:hanging="360"/>
+      </w:pPr>
+      <w:rPr>
+        <w:rFonts w:ascii="Symbol" w:hAnsi="Symbol" w:hint="default"/>
+      </w:rPr>
+    </w:lvl>
+    <w:lvl w:ilvl="4" w:tplc="08090003" w:tentative="1">
+      <w:start w:val="1"/>
+      <w:numFmt w:val="bullet"/>
+      <w:lvlText w:val="o"/>
+      <w:lvlJc w:val="left"/>
+      <w:pPr>
+        <w:ind w:left="3960" w:hanging="360"/>
+      </w:pPr>
+      <w:rPr>
+        <w:rFonts w:ascii="Courier New" w:hAnsi="Courier New" w:cs="Courier New" w:hint="default"/>
+      </w:rPr>
+    </w:lvl>
+    <w:lvl w:ilvl="5" w:tplc="08090005" w:tentative="1">
+      <w:start w:val="1"/>
+      <w:numFmt w:val="bullet"/>
+      <w:lvlText w:val=""/>
+      <w:lvlJc w:val="left"/>
+      <w:pPr>
+        <w:ind w:left="4680" w:hanging="360"/>
+      </w:pPr>
+      <w:rPr>
+        <w:rFonts w:ascii="Wingdings" w:hAnsi="Wingdings" w:hint="default"/>
+      </w:rPr>
+    </w:lvl>
+    <w:lvl w:ilvl="6" w:tplc="08090001" w:tentative="1">
+      <w:start w:val="1"/>
+      <w:numFmt w:val="bullet"/>
+      <w:lvlText w:val=""/>
+      <w:lvlJc w:val="left"/>
+      <w:pPr>
+        <w:ind w:left="5400" w:hanging="360"/>
+      </w:pPr>
+      <w:rPr>
+        <w:rFonts w:ascii="Symbol" w:hAnsi="Symbol" w:hint="default"/>
+      </w:rPr>
+    </w:lvl>
+    <w:lvl w:ilvl="7" w:tplc="08090003" w:tentative="1">
+      <w:start w:val="1"/>
+      <w:numFmt w:val="bullet"/>
+      <w:lvlText w:val="o"/>
+      <w:lvlJc w:val="left"/>
+      <w:pPr>
+        <w:ind w:left="6120" w:hanging="360"/>
+      </w:pPr>
+      <w:rPr>
+        <w:rFonts w:ascii="Courier New" w:hAnsi="Courier New" w:cs="Courier New" w:hint="default"/>
+      </w:rPr>
+    </w:lvl>
+    <w:lvl w:ilvl="8" w:tplc="08090005" w:tentative="1">
+      <w:start w:val="1"/>
+      <w:numFmt w:val="bullet"/>
+      <w:lvlText w:val=""/>
+      <w:lvlJc w:val="left"/>
+      <w:pPr>
+        <w:ind w:left="6840" w:hanging="360"/>
+      </w:pPr>
+      <w:rPr>
+        <w:rFonts w:ascii="Wingdings" w:hAnsi="Wingdings" w:hint="default"/>
+      </w:rPr>
+    </w:lvl>
+  </w:abstractNum>
+  <w:abstractNum w:abstractNumId="2" w15:restartNumberingAfterBreak="0">
     <w:nsid w:val="2A1221BB"/>
     <w:multiLevelType w:val="hybridMultilevel"/>
     <w:tmpl w:val="7E0CF6CC"/>
@@ -354,7 +727,120 @@
       </w:rPr>
     </w:lvl>
   </w:abstractNum>
-  <w:abstractNum w:abstractNumId="2" w15:restartNumberingAfterBreak="0">
+  <w:abstractNum w:abstractNumId="3" w15:restartNumberingAfterBreak="0">
+    <w:nsid w:val="35A65123"/>
+    <w:multiLevelType w:val="hybridMultilevel"/>
+    <w:tmpl w:val="032C2BC4"/>
+    <w:lvl w:ilvl="0" w:tplc="08090001">
+      <w:start w:val="1"/>
+      <w:numFmt w:val="bullet"/>
+      <w:lvlText w:val=""/>
+      <w:lvlJc w:val="left"/>
+      <w:pPr>
+        <w:ind w:left="720" w:hanging="360"/>
+      </w:pPr>
+      <w:rPr>
+        <w:rFonts w:ascii="Symbol" w:hAnsi="Symbol" w:hint="default"/>
+      </w:rPr>
+    </w:lvl>
+    <w:lvl w:ilvl="1" w:tplc="08090003">
+      <w:start w:val="1"/>
+      <w:numFmt w:val="bullet"/>
+      <w:lvlText w:val="o"/>
+      <w:lvlJc w:val="left"/>
+      <w:pPr>
+        <w:ind w:left="1440" w:hanging="360"/>
+      </w:pPr>
+      <w:rPr>
+        <w:rFonts w:ascii="Courier New" w:hAnsi="Courier New" w:cs="Courier New" w:hint="default"/>
+      </w:rPr>
+    </w:lvl>
+    <w:lvl w:ilvl="2" w:tplc="08090005" w:tentative="1">
+      <w:start w:val="1"/>
+      <w:numFmt w:val="bullet"/>
+      <w:lvlText w:val=""/>
+      <w:lvlJc w:val="left"/>
+      <w:pPr>
+        <w:ind w:left="2160" w:hanging="360"/>
+      </w:pPr>
+      <w:rPr>
+        <w:rFonts w:ascii="Wingdings" w:hAnsi="Wingdings" w:hint="default"/>
+      </w:rPr>
+    </w:lvl>
+    <w:lvl w:ilvl="3" w:tplc="08090001" w:tentative="1">
+      <w:start w:val="1"/>
+      <w:numFmt w:val="bullet"/>
+      <w:lvlText w:val=""/>
+      <w:lvlJc w:val="left"/>
+      <w:pPr>
+        <w:ind w:left="2880" w:hanging="360"/>
+      </w:pPr>
+      <w:rPr>
+        <w:rFonts w:ascii="Symbol" w:hAnsi="Symbol" w:hint="default"/>
+      </w:rPr>
+    </w:lvl>
+    <w:lvl w:ilvl="4" w:tplc="08090003" w:tentative="1">
+      <w:start w:val="1"/>
+      <w:numFmt w:val="bullet"/>
+      <w:lvlText w:val="o"/>
+      <w:lvlJc w:val="left"/>
+      <w:pPr>
+        <w:ind w:left="3600" w:hanging="360"/>
+      </w:pPr>
+      <w:rPr>
+        <w:rFonts w:ascii="Courier New" w:hAnsi="Courier New" w:cs="Courier New" w:hint="default"/>
+      </w:rPr>
+    </w:lvl>
+    <w:lvl w:ilvl="5" w:tplc="08090005" w:tentative="1">
+      <w:start w:val="1"/>
+      <w:numFmt w:val="bullet"/>
+      <w:lvlText w:val=""/>
+      <w:lvlJc w:val="left"/>
+      <w:pPr>
+        <w:ind w:left="4320" w:hanging="360"/>
+      </w:pPr>
+      <w:rPr>
+        <w:rFonts w:ascii="Wingdings" w:hAnsi="Wingdings" w:hint="default"/>
+      </w:rPr>
+    </w:lvl>
+    <w:lvl w:ilvl="6" w:tplc="08090001" w:tentative="1">
+      <w:start w:val="1"/>
+      <w:numFmt w:val="bullet"/>
+      <w:lvlText w:val=""/>
+      <w:lvlJc w:val="left"/>
+      <w:pPr>
+        <w:ind w:left="5040" w:hanging="360"/>
+      </w:pPr>
+      <w:rPr>
+        <w:rFonts w:ascii="Symbol" w:hAnsi="Symbol" w:hint="default"/>
+      </w:rPr>
+    </w:lvl>
+    <w:lvl w:ilvl="7" w:tplc="08090003" w:tentative="1">
+      <w:start w:val="1"/>
+      <w:numFmt w:val="bullet"/>
+      <w:lvlText w:val="o"/>
+      <w:lvlJc w:val="left"/>
+      <w:pPr>
+        <w:ind w:left="5760" w:hanging="360"/>
+      </w:pPr>
+      <w:rPr>
+        <w:rFonts w:ascii="Courier New" w:hAnsi="Courier New" w:cs="Courier New" w:hint="default"/>
+      </w:rPr>
+    </w:lvl>
+    <w:lvl w:ilvl="8" w:tplc="08090005" w:tentative="1">
+      <w:start w:val="1"/>
+      <w:numFmt w:val="bullet"/>
+      <w:lvlText w:val=""/>
+      <w:lvlJc w:val="left"/>
+      <w:pPr>
+        <w:ind w:left="6480" w:hanging="360"/>
+      </w:pPr>
+      <w:rPr>
+        <w:rFonts w:ascii="Wingdings" w:hAnsi="Wingdings" w:hint="default"/>
+      </w:rPr>
+    </w:lvl>
+  </w:abstractNum>
+  <w:abstractNum w:abstractNumId="4" w15:restartNumberingAfterBreak="0">
     <w:nsid w:val="692B5E95"/>
     <w:multiLevelType w:val="hybridMultilevel"/>
     <w:tmpl w:val="6AD03B7C"/>
@@ -467,7 +953,7 @@
       </w:rPr>
     </w:lvl>
   </w:abstractNum>
-  <w:abstractNum w:abstractNumId="3" w15:restartNumberingAfterBreak="0">
+  <w:abstractNum w:abstractNumId="5" w15:restartNumberingAfterBreak="0">
     <w:nsid w:val="746A5C0A"/>
     <w:multiLevelType w:val="hybridMultilevel"/>
     <w:tmpl w:val="50DEA51A"/>
@@ -580,7 +1066,7 @@
       </w:rPr>
     </w:lvl>
   </w:abstractNum>
-  <w:abstractNum w:abstractNumId="4" w15:restartNumberingAfterBreak="0">
+  <w:abstractNum w:abstractNumId="6" w15:restartNumberingAfterBreak="0">
     <w:nsid w:val="797425C7"/>
     <w:multiLevelType w:val="hybridMultilevel"/>
     <w:tmpl w:val="1316934A"/>
@@ -667,19 +1153,25 @@
     </w:lvl>
   </w:abstractNum>
   <w:num w:numId="1" w16cid:durableId="853226515">
-    <w:abstractNumId w:val="3"/>
+    <w:abstractNumId w:val="5"/>
   </w:num>
   <w:num w:numId="2" w16cid:durableId="1597787845">
-    <w:abstractNumId w:val="1"/>
+    <w:abstractNumId w:val="2"/>
   </w:num>
   <w:num w:numId="3" w16cid:durableId="1477526337">
-    <w:abstractNumId w:val="2"/>
+    <w:abstractNumId w:val="4"/>
   </w:num>
   <w:num w:numId="4" w16cid:durableId="2027368701">
     <w:abstractNumId w:val="0"/>
   </w:num>
   <w:num w:numId="5" w16cid:durableId="223413464">
-    <w:abstractNumId w:val="4"/>
+    <w:abstractNumId w:val="6"/>
+  </w:num>
+  <w:num w:numId="6" w16cid:durableId="726685134">
+    <w:abstractNumId w:val="1"/>
+  </w:num>
+  <w:num w:numId="7" w16cid:durableId="77021429">
+    <w:abstractNumId w:val="3"/>
   </w:num>
 </w:numbering>
 </file>

</xml_diff>